<commit_message>
Audit Grant Radar and repair interaction and export defects
</commit_message>
<xml_diff>
--- a/grant-radar/dist/Nami_Grant_Radar_Quick_Start.docx
+++ b/grant-radar/dist/Nami_Grant_Radar_Quick_Start.docx
@@ -12,7 +12,7 @@
     </w:p>
     <w:p>
       <w:r>
-        <w:t>Revision date: 2026-09-12. Application version: 1.0.0.</w:t>
+        <w:t>Revision date: 2026-09-12. Application version: 1.0.1.</w:t>
       </w:r>
     </w:p>
     <w:p>
@@ -113,7 +113,7 @@
         <w:ind w:left="461" w:hanging="403"/>
       </w:pPr>
       <w:r>
-        <w:t>9.  From Exports, download schema-version-2 JSON and manually import it into the Grant Dashboard. A lead remains an opportunity, not an award.</w:t>
+        <w:t>9.  From Exports, choose public leads or fictional samples separately and download schema-version-2 JSON and manually import it into the Grant Dashboard. A lead remains an opportunity, not an award.</w:t>
       </w:r>
       <w:r>
         <w:br/>
@@ -158,7 +158,7 @@
         <w:color w:val="5A696E"/>
         <w:sz w:val="16"/>
       </w:rPr>
-      <w:t>Nami Grant Radar · 2026-09-12 · Version 1.0.0</w:t>
+      <w:t>Nami Grant Radar · 2026-09-12 · Version 1.0.1</w:t>
     </w:r>
   </w:p>
 </w:ftr>

</xml_diff>

<commit_message>
Audit Grant Radar 2.1.0 and the Grant Dashboard against the ADHD design principles
Grant Radar: Home is three named lists (Coming up, Needs checking,
Shortlisted) instead of three counts; filter chips lose their counts; the
tour shows a row of dots instead of "Tip 1 of 6"; page tips gain Later;
the status row offers five choices, with Archived and Closed shown only
on a lead that is one; "in 4 days" reads "4 days"; a hard-coded dated
line on Find grants is gone. Guides, PDF and Word copies rebuilt from the
same words; a browser test covers the new behaviour (25 tests pass).

Grant Dashboard: em dashes out of everything a person reads; the sidebar
slogan removed; the privacy reminder moved from under every page heading
to the footer; "It was awarded — move to Grants" is "Awarded: move to
Grants". Manual, quick start, Word and PDF copies regenerated.

Co-Authored-By: Claude Fable 5.1 <noreply@anthropic.com>
Claude-Session: https://claude.ai/code/session_01UeNbnbfDF294GuLrYoC2BB
</commit_message>
<xml_diff>
--- a/grant-radar/dist/Nami_Grant_Radar_Quick_Start.docx
+++ b/grant-radar/dist/Nami_Grant_Radar_Quick_Start.docx
@@ -55,7 +55,7 @@
         <w:t xml:space="preserve">Look at Home. </w:t>
       </w:r>
       <w:r>
-        <w:t xml:space="preserve">Home shows what is due in the next 30 days, what needs checking, and what is shortlisted. Tap a card to see those leads.</w:t>
+        <w:t xml:space="preserve">Home shows three short lists: what is coming up, what needs checking, and what is shortlisted. Tap a lead to open it.</w:t>
       </w:r>
     </w:p>
     <w:p>
@@ -202,7 +202,7 @@
           <w:sz w:val="18"/>
           <w:szCs w:val="18"/>
         </w:rPr>
-        <w:t xml:space="preserve">Grant Radar 2.0.0 · 2026-10-05. Use public information only.</w:t>
+        <w:t xml:space="preserve">Grant Radar 2.1.0 · 2026-10-05. Use public information only.</w:t>
       </w:r>
     </w:p>
     <w:sectPr>

</xml_diff>